<commit_message>
Fix two incorrect Table I cells found during a full numerical audit
Decision Tree validation RMSE/R2 (0.0333/0.9947) and the entire LSTM
validation row (0.0322/0.0175/0.9951) did not match
outputs/tables/validation_metrics.csv when rounded correctly - off
since the team's very first draft, before any of this session's
changes, and missed by every prior review pass. Correct values:
Decision Tree 0.0332/0.9948, LSTM 0.0329/0.0179/0.9949.

Verified by writing a script that rounds every cell in the committed
validation/test CSVs to 4 decimal places and diffs it against what
the paper actually states - Table II (test) was already fully
correct; only these two Table I (validation) cells were wrong.

Reran the full (non-quick) pipeline end to end as part of this audit;
every number now in the paper matches this run's output exactly.
</commit_message>
<xml_diff>
--- a/reports/CS171-FinalReport.docx
+++ b/reports/CS171-FinalReport.docx
@@ -1371,7 +1371,7 @@
                 <w:sz w:val="18"/>
                 <w:szCs w:val="18"/>
               </w:rPr>
-              <w:t>0.0333</w:t>
+              <w:t>0.0332</w:t>
             </w:r>
           </w:p>
         </w:tc>
@@ -1437,7 +1437,7 @@
                 <w:sz w:val="18"/>
                 <w:szCs w:val="18"/>
               </w:rPr>
-              <w:t>0.9947</w:t>
+              <w:t>0.9948</w:t>
             </w:r>
           </w:p>
         </w:tc>
@@ -1758,7 +1758,7 @@
                 <w:sz w:val="18"/>
                 <w:szCs w:val="18"/>
               </w:rPr>
-              <w:t>0.0322</w:t>
+              <w:t>0.0329</w:t>
             </w:r>
           </w:p>
         </w:tc>
@@ -1791,7 +1791,7 @@
                 <w:sz w:val="18"/>
                 <w:szCs w:val="18"/>
               </w:rPr>
-              <w:t>0.0175</w:t>
+              <w:t>0.0179</w:t>
             </w:r>
           </w:p>
         </w:tc>
@@ -1824,7 +1824,7 @@
                 <w:sz w:val="18"/>
                 <w:szCs w:val="18"/>
               </w:rPr>
-              <w:t>0.9951</w:t>
+              <w:t>0.9949</w:t>
             </w:r>
           </w:p>
         </w:tc>

</xml_diff>

<commit_message>
Add Acknowledgment section linking the repo, add spacing before References
Per the official IEEE template (CS171-IEEE-Paper-Template.docx), which
includes an optional Acknowledgment section between Conclusion and
Author Contributions for crediting datasets/tools - the paper was
missing this section entirely. Added it with a link to this repo,
which is the natural, template-sanctioned place for it (rather than
scattering the link elsewhere).

Also added a spacer paragraph between Author Contributions and the
References heading for clearer visual separation.

No figures, code, or other text touched - verified via docx schema
validation (paragraph count +3, exactly the 2 new Acknowledgment
paragraphs + 1 spacer) and a full visual re-render.
</commit_message>
<xml_diff>
--- a/reports/CS171-FinalReport.docx
+++ b/reports/CS171-FinalReport.docx
@@ -3213,7 +3213,7 @@
           <w:b/>
           <w:bCs/>
         </w:rPr>
-        <w:t>Author Contributions</w:t>
+        <w:t>Acknowledgment</w:t>
       </w:r>
     </w:p>
     <w:p>
@@ -3227,8 +3227,40 @@
           <w:i w:val="0"/>
           <w:color w:val="000000"/>
         </w:rPr>
+        <w:t>Code, data-processing scripts, and full reproducibility instructions for this project are available at https://github.com/oops408/cs171project.</w:t>
+      </w:r>
+    </w:p>
+    <w:p>
+      <w:pPr>
+        <w:spacing w:before="200" w:after="90"/>
+        <w:jc w:val="center"/>
+      </w:pPr>
+      <w:r>
+        <w:rPr>
+          <w:b/>
+          <w:bCs/>
+        </w:rPr>
+        <w:t>Author Contributions</w:t>
+      </w:r>
+    </w:p>
+    <w:p>
+      <w:pPr>
+        <w:spacing w:after="120" w:line="252" w:lineRule="auto"/>
+        <w:jc w:val="both"/>
+      </w:pPr>
+      <w:r>
+        <w:rPr>
+          <w:b w:val="0"/>
+          <w:i w:val="0"/>
+          <w:color w:val="000000"/>
+        </w:rPr>
         <w:t>Suparn Posina built the data pipeline and feature-engineering code and set up the reproducible training and evaluation harness. Arushi Nirmal trained and tuned the models, produced the figures and tables, and led the error analysis. Nathan Montero led the writing of the paper and the interpretation of results. We all worked on and published our findings in this report.</w:t>
       </w:r>
+    </w:p>
+    <w:p>
+      <w:pPr>
+        <w:spacing w:after="140"/>
+      </w:pPr>
     </w:p>
     <w:p>
       <w:pPr>

</xml_diff>